<commit_message>
Consistency fixes: generated data facts, citations, supplementary references, equation rendering, condensed supplement tables
Co-Authored-By: Claude Opus 5.5 <noreply@anthropic.com>
Claude-Session: https://claude.ai/code/session_01GRaL3aKCgpJNtcS7frCXJ4
</commit_message>
<xml_diff>
--- a/Reinforced_Research_Project/manuscript/Revised_Cover_Letter.docx
+++ b/Reinforced_Research_Project/manuscript/Revised_Cover_Letter.docx
@@ -120,7 +120,7 @@
         <w:pStyle w:val="BodyText"/>
       </w:pPr>
       <w:r>
-        <w:t xml:space="preserve">On three public data sets the answer to the first question was no. Uncertainty ranges taken over from the original calibration covered as few as 0.03 of the reference values instead of 90%. The good news is that the reference samples needed for the transfer are enough to restore a valid range: the transfer is simply re-fitted with each sample left out in turn, and no extra measurements are needed.</w:t>
+        <w:t xml:space="preserve">On three public data sets the answer to the first question was no. For uncertainty ranges taken over from the original calibration, the coverage of nominal 90% intervals fell as low as 0.03. The good news is that the reference samples needed for the transfer are enough to restore a valid range: the transfer is simply re-fitted with each sample left out in turn, and no extra measurements are needed.</w:t>
       </w:r>
     </w:p>
     <w:p>
@@ -128,7 +128,7 @@
         <w:pStyle w:val="BodyText"/>
       </w:pPr>
       <w:r>
-        <w:t xml:space="preserve">The finding we consider most useful for practice concerns where the reference samples come from. With mango data that record the consignment of every fruit, 20 reference fruit from two consignments gave intervals that were too narrow for fruit from other consignments in 6 of 8 instrument and season settings. The usual alternatives, including Gaussian and random-effects intervals, failed in the same way. The same 20 fruit spread over many consignments did not. In a harvest-maturity check of mango at the industry minimum of 14% dry matter, the usual point rule passed 45% of immature fruit; valid intervals from well-spread standards reduced this to 3.8% and showed which fruit needed a second look. The rule that follows, take transfer standards from many batches, costs nothing and can be applied immediately.</w:t>
+        <w:t xml:space="preserve">The finding we consider most useful for practice concerns where the reference samples come from. With mango data that record the consignment of every fruit, 20 reference fruit from two consignments gave intervals that were too narrow for fruit from other consignments in 6 of 8 instrument and season settings. The usual alternatives, including Gaussian and random-effects intervals, failed in the same way. Spreading the same 20 fruit over many consignments avoided this. In a harvest-maturity check of mango at the industry minimum of 14% dry matter, the usual point rule passed 45% of immature fruit; valid intervals from well-spread standards reduced this to 3.8% and showed which fruit needed a second look. The rule that follows, take transfer standards from many batches, costs nothing and can be applied immediately.</w:t>
       </w:r>
     </w:p>
     <w:p>

</xml_diff>

<commit_message>
E10 re-run with corrected ANOVA-PI (other methods reproduced exactly), updated analyses, values, manuscript, supplement and review records
Co-Authored-By: Claude Opus 5.5 <noreply@anthropic.com>
Claude-Session: https://claude.ai/code/session_01GRaL3aKCgpJNtcS7frCXJ4
</commit_message>
<xml_diff>
--- a/Reinforced_Research_Project/manuscript/Revised_Cover_Letter.docx
+++ b/Reinforced_Research_Project/manuscript/Revised_Cover_Letter.docx
@@ -120,7 +120,7 @@
         <w:pStyle w:val="BodyText"/>
       </w:pPr>
       <w:r>
-        <w:t xml:space="preserve">On three public data sets the answer to the first question was no. For uncertainty ranges taken over from the original calibration, the coverage of nominal 90% intervals fell as low as 0.03. The good news is that the reference samples needed for the transfer are enough to restore a valid range: the transfer is simply re-fitted with each sample left out in turn, and no extra measurements are needed.</w:t>
+        <w:t xml:space="preserve">On three public data sets the answer to the first question was no. For uncertainty ranges taken over from the original calibration, the coverage of nominal 90% intervals fell as low as 0.03. The reference samples needed for the transfer are enough to restore a valid range: the transfer is re-fitted with each sample left out in turn, and no extra measurements are needed. We also report candidly that simple Gaussian and regression intervals built from the same left-out errors were nearly as good at 90%.</w:t>
       </w:r>
     </w:p>
     <w:p>
@@ -128,7 +128,7 @@
         <w:pStyle w:val="BodyText"/>
       </w:pPr>
       <w:r>
-        <w:t xml:space="preserve">The finding we consider most useful for practice concerns where the reference samples come from. With mango data that record the consignment of every fruit, 20 reference fruit from two consignments gave intervals that were too narrow for fruit from other consignments in 6 of 8 instrument and season settings. The usual alternatives, including Gaussian and random-effects intervals, failed in the same way. Spreading the same 20 fruit over many consignments avoided this. In a harvest-maturity check of mango at the industry minimum of 14% dry matter, the usual point rule passed 45% of immature fruit; valid intervals from well-spread standards reduced this to 3.8% and showed which fruit needed a second look. The rule that follows, take transfer standards from many batches, costs nothing and can be applied immediately.</w:t>
+        <w:t xml:space="preserve">The finding we consider most useful for practice concerns where the reference samples come from. With mango data that record the consignment of every fruit, 20 reference fruit from two consignments gave intervals that were too narrow for fruit from other consignments in 6 of 8 instrument and season settings. Gaussian and split-sample intervals failed in the same way. Spreading the same 20 fruit over many consignments, or leaving out whole consignments when estimating the errors, avoided this. In a harvest-maturity check of mango at the recommended minimum of 14% dry matter, deciding on the predicted value alone passed 36% of immature fruit; intervals from well-spread reference fruit reduced this to 3.2%, against 9.8% with fruit from two consignments, and flagged the fruit that needed a second measurement. The rule that follows, take transfer standards from many batches, costs nothing and can be applied immediately.</w:t>
       </w:r>
     </w:p>
     <w:p>
@@ -136,7 +136,7 @@
         <w:pStyle w:val="BodyText"/>
       </w:pPr>
       <w:r>
-        <w:t xml:space="preserve">The work fits the journal’s interest in chemometric methods with important applications. It addresses measurement uncertainty of transferred analytical methods, it is phrased in method-validation terms, and it ends with a concrete procedure. We do not claim new statistical theory: the interval construction is an application of the jackknife+ and of its batch-level version, which we cite. The contribution is the evidence on when such intervals hold after calibration transfer, the comparison with the methods laboratories actually use, and the resulting sampling rule.</w:t>
+        <w:t xml:space="preserve">The work fits the journal’s interest in chemometric methods with important applications. It addresses measurement uncertainty of transferred analytical methods, it is phrased in method-validation terms, and it ends with a concrete procedure. We do not claim new statistical theory: the interval construction is an application of the jackknife+ and of its batch-level version, which we cite. The contribution is the evidence on when such intervals hold after calibration transfer, the comparison with the methods laboratories actually use, and the resulting sampling rule. The batch evidence comes from one product, which we state as a limitation.</w:t>
       </w:r>
     </w:p>
     <w:p>

</xml_diff>

<commit_message>
Verification-pass fixes (TJ+G/TJ+B wording, fair Table 3 at 95%, abstract, procedure, protocol statement, cover letter, ANOVA-PI description); final decision
Co-Authored-By: Claude Opus 5.5 <noreply@anthropic.com>
Claude-Session: https://claude.ai/code/session_01GRaL3aKCgpJNtcS7frCXJ4
</commit_message>
<xml_diff>
--- a/Reinforced_Research_Project/manuscript/Revised_Cover_Letter.docx
+++ b/Reinforced_Research_Project/manuscript/Revised_Cover_Letter.docx
@@ -120,7 +120,7 @@
         <w:pStyle w:val="BodyText"/>
       </w:pPr>
       <w:r>
-        <w:t xml:space="preserve">On three public data sets the answer to the first question was no. For uncertainty ranges taken over from the original calibration, the coverage of nominal 90% intervals fell as low as 0.03. The reference samples needed for the transfer are enough to restore a valid range: the transfer is re-fitted with each sample left out in turn, and no extra measurements are needed. We also report candidly that simple Gaussian and regression intervals built from the same left-out errors were nearly as good at 90%.</w:t>
+        <w:t xml:space="preserve">On three public data sets the answer to the first question was no. For uncertainty ranges taken over from the original calibration, the coverage of nominal 90% intervals fell as low as 0.03. The reference samples needed for the transfer are enough to restore a valid range: the transfer is re-fitted with each sample left out in turn, and no extra measurements are needed. Simple Gaussian and regression intervals built from the same left-out errors were nearly as good at 90%, and the paper says so.</w:t>
       </w:r>
     </w:p>
     <w:p>
@@ -128,7 +128,7 @@
         <w:pStyle w:val="BodyText"/>
       </w:pPr>
       <w:r>
-        <w:t xml:space="preserve">The finding we consider most useful for practice concerns where the reference samples come from. With mango data that record the consignment of every fruit, 20 reference fruit from two consignments gave intervals that were too narrow for fruit from other consignments in 6 of 8 instrument and season settings. Gaussian and split-sample intervals failed in the same way. Spreading the same 20 fruit over many consignments, or leaving out whole consignments when estimating the errors, avoided this. In a harvest-maturity check of mango at the recommended minimum of 14% dry matter, deciding on the predicted value alone passed 36% of immature fruit; intervals from well-spread reference fruit reduced this to 3.2%, against 9.8% with fruit from two consignments, and flagged the fruit that needed a second measurement. The rule that follows, take transfer standards from many batches, costs nothing and can be applied immediately.</w:t>
+        <w:t xml:space="preserve">The finding we consider most useful for practice concerns where the reference samples come from. With mango data that record the consignment of every fruit, 20 reference fruit from two consignments gave intervals that were too narrow for fruit from other consignments in 6 of 8 instrument and season settings. Gaussian and split-sample intervals failed in the same way. Spreading the same 20 fruit over many consignments, or leaving out whole consignments when estimating the errors, avoided this; with whole consignments left out, the jackknife+ and classical Gaussian and random-effects formulas all performed well. In a harvest-maturity check of mango at the recommended minimum of 14% dry matter, deciding on the predicted value alone passed 36–41% of immature fruit; intervals from well-spread reference fruit reduced this to 3.2%, against 9.8% with fruit from two consignments, and flagged the fruit that needed a second measurement. The rule that follows, take transfer standards from many batches, costs nothing and can be applied immediately.</w:t>
       </w:r>
     </w:p>
     <w:p>

</xml_diff>